<commit_message>
Ship the desktop client beside the web one, and make the test scripts findable
The exercise 4 readme now describes a folder that holds both clients: the web
one that this exercise adds, and the JavaFX one from exercise 3, so a grader
can run the two side by side against the one server and watch an event made in
either appear in the other. It also says plainly how to be two users at once,
which is the question anybody trying the web client asks within a minute.

The shell test suites called python by its bare name, and on this machine the
Microsoft Store's placeholder answers to that name from some folders and says
Python is not installed. They now honour a PYTHON variable, so the suites can
be pointed at the real one without editing them.

Co-Authored-By: Claude Fable 5.1 <noreply@anthropic.com>
</commit_message>
<xml_diff>
--- a/README-EX4.docx
+++ b/README-EX4.docx
@@ -137,22 +137,22 @@
         <w:bidi w:val="0"/>
       </w:pPr>
       <w:r>
-        <w:t xml:space="preserve">Start the exercise 3 server exactly as before: put guess-market.war into tomcat\webapps and start Tomcat. The war is in this zip - it is the very same file submitted for exercise 3, so this runs against the server that was graded, not a rebuild of it. Nothing about the server changes for this exercise, and this client does not need it set up any differently.</w:t>
-      </w:r>
-    </w:p>
-    <w:p>
-      <w:pPr>
-        <w:pStyle w:val="GMBullet"/>
-        <w:numPr>
-          <w:ilvl w:val="0"/>
-          <w:numId w:val="1"/>
-        </w:numPr>
-        <w:spacing w:before="0" w:after="60"/>
-        <w:jc w:val="left"/>
-        <w:bidi w:val="0"/>
-      </w:pPr>
-      <w:r>
-        <w:t xml:space="preserve">Double click run-web.bat. It starts a small Node server and prints the address. Leave that window open while you are using the client; closing it stops the client.</w:t>
+        <w:t xml:space="preserve">Start the server: put guess-market.war into tomcat\webapps and start Tomcat. The war is in this zip - it is the very same file submitted for exercise 3, so this runs against the server that was graded, not a rebuild of it. Nothing about the server changes for this exercise, and this client does not need it set up any differently.</w:t>
+      </w:r>
+    </w:p>
+    <w:p>
+      <w:pPr>
+        <w:pStyle w:val="GMBullet"/>
+        <w:numPr>
+          <w:ilvl w:val="0"/>
+          <w:numId w:val="1"/>
+        </w:numPr>
+        <w:spacing w:before="0" w:after="60"/>
+        <w:jc w:val="left"/>
+        <w:bidi w:val="0"/>
+      </w:pPr>
+      <w:r>
+        <w:t xml:space="preserve">Start the web client: double click run-web.bat. It starts a small Node server and prints the address. Leave that window open while you are using the client; closing it stops the client.</w:t>
       </w:r>
     </w:p>
     <w:p>
@@ -197,7 +197,7 @@
         <w:bidi w:val="0"/>
       </w:pPr>
       <w:r>
-        <w:t xml:space="preserve">To use two users at once, open a second browser profile or an incognito/private window. Two ordinary tabs share one cookie and so are one user - that is how browsers work, and it is the one place where the web client cannot behave like two separate JavaFX processes.</w:t>
+        <w:t xml:space="preserve">To have two users at once, the easiest way is to run the desktop client as well: desktop-client\run.bat starts the JavaFX client from exercise 3, which is included here so both kinds of client can be seen working against the one server at the same time. Each copy of it you start is a separate user. A second browser user needs an incognito/private window or another browser - two ordinary tabs share one cookie and so are one user. That is how browsers work, and it is the one place where the web client cannot behave like two separate JavaFX processes.</w:t>
       </w:r>
     </w:p>
     <w:p>
@@ -489,6 +489,68 @@
       </w:pPr>
       <w:r>
         <w:t xml:space="preserve">Everything refreshes by itself once a second, so other people's trades, uploads and closings appear without pressing anything. If the server goes away the header says so quietly and keeps retrying, and it picks up again by itself when the server comes back.</w:t>
+      </w:r>
+    </w:p>
+    <w:p>
+      <w:pPr>
+        <w:pStyle w:val="GMHeading"/>
+        <w:spacing w:before="220" w:after="100"/>
+        <w:jc w:val="left"/>
+        <w:bidi w:val="0"/>
+      </w:pPr>
+      <w:r>
+        <w:t xml:space="preserve">What is in this folder</w:t>
+      </w:r>
+    </w:p>
+    <w:p>
+      <w:pPr>
+        <w:pStyle w:val="GMBody"/>
+        <w:spacing w:before="0" w:after="70"/>
+        <w:jc w:val="left"/>
+        <w:bidi w:val="0"/>
+      </w:pPr>
+      <w:r>
+        <w:rPr>
+          <w:b/>
+        </w:rPr>
+        <w:t xml:space="preserve">run-web.bat and web\ - </w:t>
+      </w:r>
+      <w:r>
+        <w:t xml:space="preserve">the web client. This is what exercise 4 adds.</w:t>
+      </w:r>
+    </w:p>
+    <w:p>
+      <w:pPr>
+        <w:pStyle w:val="GMBody"/>
+        <w:spacing w:before="0" w:after="70"/>
+        <w:jc w:val="left"/>
+        <w:bidi w:val="0"/>
+      </w:pPr>
+      <w:r>
+        <w:rPr>
+          <w:b/>
+        </w:rPr>
+        <w:t xml:space="preserve">guess-market.war - </w:t>
+      </w:r>
+      <w:r>
+        <w:t xml:space="preserve">the exercise 3 server, unchanged.</w:t>
+      </w:r>
+    </w:p>
+    <w:p>
+      <w:pPr>
+        <w:pStyle w:val="GMBody"/>
+        <w:spacing w:before="0" w:after="70"/>
+        <w:jc w:val="left"/>
+        <w:bidi w:val="0"/>
+      </w:pPr>
+      <w:r>
+        <w:rPr>
+          <w:b/>
+        </w:rPr>
+        <w:t xml:space="preserve">desktop-client\ - </w:t>
+      </w:r>
+      <w:r>
+        <w:t xml:space="preserve">the exercise 3 JavaFX client (its jars and run.bat), unchanged. It is not part of exercise 4 and is here only so the two clients can be run side by side against the same server: an event uploaded or created in one appears in the other within a second.</w:t>
       </w:r>
     </w:p>
     <w:p>

</xml_diff>